<commit_message>
docs: add usage guidelines for SP2D recap module
</commit_message>
<xml_diff>
--- a/docs/Pedoman_Penggunaan_Modul_Rekap_SP2D.docx
+++ b/docs/Pedoman_Penggunaan_Modul_Rekap_SP2D.docx
@@ -224,7 +224,7 @@
           <w:color w:val="1F2937"/>
           <w:sz w:val="21"/>
         </w:rPr>
-        <w:t>Pengelompokan otomatis Jalur Transaksi (1 Pihak, Banyak Pihak, dan GUP).</w:t>
+        <w:t>Pengelompokan otomatis Jalur Transaksi (1 Pihak, Banyak Pihak, dan UP).</w:t>
       </w:r>
     </w:p>
     <w:p>
@@ -1057,7 +1057,7 @@
                 <w:color w:val="374151"/>
                 <w:sz w:val="19"/>
               </w:rPr>
-              <w:t>GUP</w:t>
+              <w:t>UP</w:t>
             </w:r>
           </w:p>
         </w:tc>
@@ -1082,7 +1082,7 @@
                 <w:color w:val="374151"/>
                 <w:sz w:val="19"/>
               </w:rPr>
-              <w:t>Ganti Uang Persediaan. Transaksi pengeluaran bendahara yang rincian pajaknya bervariasi dan tidak terikat target potongan tunggal SP2D.</w:t>
+              <w:t>Uang Persediaan. Transaksi pengeluaran bendahara yang rincian pajaknya bervariasi dan tidak terikat target potongan tunggal SP2D.</w:t>
             </w:r>
           </w:p>
         </w:tc>
@@ -1293,7 +1293,7 @@
           <w:color w:val="1F2937"/>
           <w:sz w:val="21"/>
         </w:rPr>
-        <w:t>Jalur GUP (Badge Merah):</w:t>
+        <w:t>Jalur UP (Badge Merah):</w:t>
       </w:r>
       <w:r>
         <w:rPr>
@@ -1301,7 +1301,7 @@
           <w:color w:val="1F2937"/>
           <w:sz w:val="21"/>
         </w:rPr>
-        <w:t xml:space="preserve"> Terdeteksi dari SPM jenis GUP. Rincian pajak dapat diisi bebas tanpa mengunci batas target nominal potongan SP2D.</w:t>
+        <w:t xml:space="preserve"> Terdeteksi dari SPM jenis UP. Rincian pajak dapat diisi bebas tanpa mengunci batas target nominal potongan SP2D.</w:t>
       </w:r>
     </w:p>
     <w:p>
@@ -2321,7 +2321,7 @@
                 <w:color w:val="374151"/>
                 <w:sz w:val="19"/>
               </w:rPr>
-              <w:t>Filter berdasarkan klasifikasi: 1 Pihak, Banyak Pihak, atau GUP.</w:t>
+              <w:t>Filter berdasarkan klasifikasi: 1 Pihak, Banyak Pihak, atau UP.</w:t>
             </w:r>
           </w:p>
         </w:tc>
@@ -2816,7 +2816,7 @@
                 <w:color w:val="374151"/>
                 <w:sz w:val="19"/>
               </w:rPr>
-              <w:t>Badge status jalur transaksi: Green (1 Pihak), Yellow (Banyak Pihak), Red (GUP).</w:t>
+              <w:t>Badge status jalur transaksi: Green (1 Pihak), Yellow (Banyak Pihak), Red (UP).</w:t>
             </w:r>
           </w:p>
         </w:tc>
@@ -3364,7 +3364,7 @@
           <w:color w:val="1F2937"/>
           <w:sz w:val="21"/>
         </w:rPr>
-        <w:t>Untuk SP2D bertipe 'Banyak Pihak' atau 'GUP', pengisian rincian pajak per penerima dilakukan melalui panel slide-over interaktif.</w:t>
+        <w:t>Untuk SP2D bertipe 'Banyak Pihak' atau 'UP', pengisian rincian pajak per penerima dilakukan melalui panel slide-over interaktif.</w:t>
       </w:r>
     </w:p>
     <w:p>
@@ -3786,7 +3786,7 @@
           <w:color w:val="1F2937"/>
           <w:sz w:val="21"/>
         </w:rPr>
-        <w:t>Status Khusus Jalur GUP:</w:t>
+        <w:t>Status Khusus Jalur UP:</w:t>
       </w:r>
       <w:r>
         <w:rPr>
@@ -3794,7 +3794,7 @@
           <w:color w:val="1F2937"/>
           <w:sz w:val="21"/>
         </w:rPr>
-        <w:t>Teks menampilkan indikator 'GUP: Tidak Terikat Target' (bebas disimpan).</w:t>
+        <w:t>Teks menampilkan indikator 'UP: Tidak Terikat Target' (bebas disimpan).</w:t>
       </w:r>
     </w:p>
     <w:p>

</xml_diff>

<commit_message>
docs(rekap-sp2d): selaraskan bab 8 panduan gambar dengan deskripsi alur dokumen
</commit_message>
<xml_diff>
--- a/docs/Pedoman_Penggunaan_Modul_Rekap_SP2D.docx
+++ b/docs/Pedoman_Penggunaan_Modul_Rekap_SP2D.docx
@@ -1801,7 +1801,7 @@
         <w:pStyle w:val="Heading1"/>
       </w:pPr>
       <w:r>
-        <w:t>BAB 3 - HAKEKAT &amp; OPERASIONAL DATA REKAP SP2D</w:t>
+        <w:t>BAB 3 - OPERASIONAL DATA REKAP SP2D</w:t>
       </w:r>
     </w:p>
     <w:p>
@@ -2459,12 +2459,7 @@
         <w:spacing w:after="80"/>
       </w:pPr>
       <w:r>
-        <w:rPr>
-          <w:rFonts w:ascii="Segoe UI" w:hAnsi="Segoe UI"/>
-          <w:color w:val="1F2937"/>
-          <w:sz w:val="21"/>
-        </w:rPr>
-        <w:t>Tabel Data Rekap SP2D menampilkan kolom-kolom utama sebagai berikut (diurutkan dari kiri ke kanan):</w:t>
+        <w:t>Tabel Data Rekap SP2D menampilkan metrik ringkasan, filter, opsi ekspor, dan kolom-kolom utama sebagai berikut (lihat Gambar 2) (diurutkan dari kiri ke kanan):</w:t>
       </w:r>
     </w:p>
     <w:tbl>
@@ -3209,12 +3204,7 @@
         <w:spacing w:after="60"/>
       </w:pPr>
       <w:r>
-        <w:rPr>
-          <w:rFonts w:ascii="Segoe UI" w:hAnsi="Segoe UI"/>
-          <w:color w:val="1F2937"/>
-          <w:sz w:val="21"/>
-        </w:rPr>
-        <w:t>Klik tombol utama 'Import SP2D MyIntress' (berwarna biru di pojok kanan atas halaman).</w:t>
+        <w:t>Klik tombol utama 'Import SP2D MyIntress' (berwarna biru di pojok kanan atas halaman, lihat Gambar 1).</w:t>
       </w:r>
     </w:p>
     <w:p>
@@ -3380,12 +3370,7 @@
         <w:spacing w:after="80"/>
       </w:pPr>
       <w:r>
-        <w:rPr>
-          <w:rFonts w:ascii="Segoe UI" w:hAnsi="Segoe UI"/>
-          <w:color w:val="1F2937"/>
-          <w:sz w:val="21"/>
-        </w:rPr>
-        <w:t>Klik tombol Edit (ikon pensil) pada baris SP2D yang hendak dilengkapi. Panel modal berukuran ekstra luas (7XL) akan meluncur dari sisi kanan layar tanpa menghilangkan konteks tabel di belakangnya.</w:t>
+        <w:t>Klik tombol Edit (ikon pensil) pada baris SP2D yang hendak dilengkapi. Panel modal berukuran ekstra luas (7XL) akan meluncur dari sisi kanan layar tanpa menghilangkan konteks tabel di belakangnya (lihat Gambar 3).</w:t>
       </w:r>
     </w:p>
     <w:p>
@@ -3496,12 +3481,7 @@
         <w:spacing w:after="60"/>
       </w:pPr>
       <w:r>
-        <w:rPr>
-          <w:rFonts w:ascii="Segoe UI" w:hAnsi="Segoe UI"/>
-          <w:color w:val="1F2937"/>
-          <w:sz w:val="21"/>
-        </w:rPr>
-        <w:t>Pilih Jenis File Excel: 'Daftar Gaji Pusat', 'Daftar Tukin', atau 'Uang Makan'.</w:t>
+        <w:t>Pilih Jenis File Excel: 'Daftar Gaji Pusat', 'Daftar Tukin', 'Uang Makan', atau 'Uang Lembur' (lihat Gambar 4).</w:t>
       </w:r>
     </w:p>
     <w:p>
@@ -3510,12 +3490,7 @@
         <w:spacing w:after="60"/>
       </w:pPr>
       <w:r>
-        <w:rPr>
-          <w:rFonts w:ascii="Segoe UI" w:hAnsi="Segoe UI"/>
-          <w:color w:val="1F2937"/>
-          <w:sz w:val="21"/>
-        </w:rPr>
-        <w:t>Pilih berkas Excel pendukung pencairan yang bersangkutan dari komputer Anda.</w:t>
+        <w:t>Pilih berkas Excel pendukung pencairan yang bersangkutan dari komputer Anda dan lakukan pengunggahan (lihat Gambar 5).</w:t>
       </w:r>
     </w:p>
     <w:p>
@@ -3538,12 +3513,7 @@
         <w:spacing w:after="60"/>
       </w:pPr>
       <w:r>
-        <w:rPr>
-          <w:rFonts w:ascii="Segoe UI" w:hAnsi="Segoe UI"/>
-          <w:color w:val="1F2937"/>
-          <w:sz w:val="21"/>
-        </w:rPr>
-        <w:t>Periksa rincian hasil ekstraksi, lalu klik 'Save changes' di bagian bawah form.</w:t>
+        <w:t>Periksa rincian hasil ekstraksi dan pastikan total rincian sesuai, lalu klik 'Save changes' di bagian bawah form (lihat Gambar 6).</w:t>
       </w:r>
     </w:p>
     <w:p>
@@ -3587,12 +3557,7 @@
         <w:spacing w:after="60"/>
       </w:pPr>
       <w:r>
-        <w:rPr>
-          <w:rFonts w:ascii="Segoe UI" w:hAnsi="Segoe UI"/>
-          <w:color w:val="1F2937"/>
-          <w:sz w:val="21"/>
-        </w:rPr>
-        <w:t>Pada kolom 'Cari Pegawai / Pihak', ketik Nama atau NIP/NPWP. Pilih dari daftar autocomplete yang muncul (sistem mencari otomatis dari Master User dan Riwayat Pajak). Nama dan NPWP/NIK akan terisi otomatis!</w:t>
+        <w:t>Pada kolom 'Cari Pegawai / Pihak', ketik Nama atau NIP/NPWP. Pilih dari daftar autocomplete yang muncul (sistem mencari otomatis dari Master User dan Riwayat Pajak). Nama dan NPWP/NIK akan terisi otomatis melalui autocomplete (lihat Gambar 7)!</w:t>
       </w:r>
     </w:p>
     <w:p>
@@ -3720,12 +3685,7 @@
         <w:spacing w:after="80"/>
       </w:pPr>
       <w:r>
-        <w:rPr>
-          <w:rFonts w:ascii="Segoe UI" w:hAnsi="Segoe UI"/>
-          <w:color w:val="1F2937"/>
-          <w:sz w:val="21"/>
-        </w:rPr>
-        <w:t>Di bagian bawah form edit terdapat teks indikator real-time 'Total Rincian Saat Ini':</w:t>
+        <w:t>Pada form edit (tampil di bagian atas daftar rincian dan di bagian bawah) terdapat teks indikator real-time 'Total Rincian Saat Ini':</w:t>
       </w:r>
     </w:p>
     <w:p>
@@ -3734,21 +3694,7 @@
         <w:spacing w:after="60"/>
       </w:pPr>
       <w:r>
-        <w:rPr>
-          <w:rFonts w:ascii="Segoe UI" w:hAnsi="Segoe UI"/>
-          <w:b/>
-          <w:color w:val="1F2937"/>
-          <w:sz w:val="21"/>
-        </w:rPr>
-        <w:t>Status (Sesuai):</w:t>
-      </w:r>
-      <w:r>
-        <w:rPr>
-          <w:rFonts w:ascii="Segoe UI" w:hAnsi="Segoe UI"/>
-          <w:color w:val="1F2937"/>
-          <w:sz w:val="21"/>
-        </w:rPr>
-        <w:t>Teks berwarna hijau: Nominal rincian pajak tepat 100% sama dengan Target Potongan SP2D. Saat disimpan, status SP2D otomatis berubah menjadi Valid.</w:t>
+        <w:t>Status (Sesuai):Teks berwarna hijau: Nominal rincian pajak tepat 100% sama dengan Target Potongan SP2D. Saat disimpan, status SP2D otomatis berubah menjadi Valid (lihat Gambar 9).</w:t>
       </w:r>
     </w:p>
     <w:p>
@@ -3780,21 +3726,7 @@
         <w:spacing w:after="60"/>
       </w:pPr>
       <w:r>
-        <w:rPr>
-          <w:rFonts w:ascii="Segoe UI" w:hAnsi="Segoe UI"/>
-          <w:b/>
-          <w:color w:val="1F2937"/>
-          <w:sz w:val="21"/>
-        </w:rPr>
-        <w:t>Status Khusus Jalur UP:</w:t>
-      </w:r>
-      <w:r>
-        <w:rPr>
-          <w:rFonts w:ascii="Segoe UI" w:hAnsi="Segoe UI"/>
-          <w:color w:val="1F2937"/>
-          <w:sz w:val="21"/>
-        </w:rPr>
-        <w:t>Teks menampilkan indikator 'UP: Tidak Terikat Target' (bebas disimpan).</w:t>
+        <w:t>Status Khusus Jalur UP:Teks menampilkan indikator 'UP: Tidak Terikat Target' (bebas disimpan, status verifikasi dapat dipilih secara manual, lihat Gambar 8).</w:t>
       </w:r>
     </w:p>
     <w:p>
@@ -3943,12 +3875,7 @@
         <w:spacing w:after="80"/>
       </w:pPr>
       <w:r>
-        <w:rPr>
-          <w:rFonts w:ascii="Segoe UI" w:hAnsi="Segoe UI"/>
-          <w:color w:val="1F2937"/>
-          <w:sz w:val="21"/>
-        </w:rPr>
-        <w:t>Halaman Rekap Per Pihak (akses: Rekap SP2D -&gt; Rekap Per Pihak) digunakan untuk menyajikan rekapitulasi akumulasi potongan pajak yang dikelompokkan per entitas penerima (kombinasi unik NPWP/NIK dan Nama Pihak). Halaman ini merupakan muara dari seluruh data SP2D berstatus Valid.</w:t>
+        <w:t>Halaman Rekap Per Pihak (akses: Rekap SP2D -&gt; Rekap Per Pihak) digunakan untuk menyajikan rekapitulasi akumulasi potongan pajak yang dikelompokkan per entitas penerima (kombinasi unik NPWP/NIK dan Nama Pihak). Halaman ini merupakan muara dari seluruh data SP2D berstatus Valid serta dilengkapi opsi ekspor CSV, Excel, dan PDF (lihat Gambar 10).</w:t>
       </w:r>
     </w:p>
     <w:p>
@@ -4196,12 +4123,7 @@
         <w:spacing w:after="80"/>
       </w:pPr>
       <w:r>
-        <w:rPr>
-          <w:rFonts w:ascii="Segoe UI" w:hAnsi="Segoe UI"/>
-          <w:color w:val="1F2937"/>
-          <w:sz w:val="21"/>
-        </w:rPr>
-        <w:t>Menu Master Akun Pajak (akses: Rekap SP2D -&gt; Akun Pajak) digunakan untuk mengelola referensi kode akun pajak pemerintah yang berlaku.</w:t>
+        <w:t>Menu Master Akun Pajak (akses: Rekap SP2D -&gt; Akun Pajak) digunakan untuk mengelola referensi kode akun pajak pemerintah yang berlaku (lihat Gambar 11 dan Gambar 12).</w:t>
       </w:r>
     </w:p>
     <w:p>
@@ -4230,12 +4152,7 @@
         <w:spacing w:after="80"/>
       </w:pPr>
       <w:r>
-        <w:rPr>
-          <w:rFonts w:ascii="Segoe UI" w:hAnsi="Segoe UI"/>
-          <w:color w:val="1F2937"/>
-          <w:sz w:val="21"/>
-        </w:rPr>
-        <w:t>Menu Master Kode SPM (akses: Rekap SP2D -&gt; Kode SPM) digunakan untuk mengelola pemetaan jenis SPM beserta aturan konfigurasi pajaknya.</w:t>
+        <w:t>Menu Master Kode SPM (akses: Rekap SP2D -&gt; Kode SPM) digunakan untuk mengelola pemetaan jenis SPM beserta aturan konfigurasi pajaknya (lihat Gambar 13 dan Gambar 14).</w:t>
       </w:r>
     </w:p>
     <w:p>
@@ -5312,9 +5229,958 @@
         <w:spacing w:after="120"/>
       </w:pPr>
     </w:p>
+    <w:p>
+      <w:pPr>
+        <w:pStyle w:val="Heading1"/>
+      </w:pPr>
+      <w:r>
+        <w:t>BAB 8 - PANDUAN GAMBAR</w:t>
+      </w:r>
+    </w:p>
+    <w:tbl>
+      <w:tblPr>
+        <w:tblStyle w:val="TableGrid"/>
+        <w:tblW w:w="0" w:type="auto"/>
+        <w:tblLook w:val="04A0" w:firstRow="1" w:lastRow="0" w:firstColumn="1" w:lastColumn="0" w:noHBand="0" w:noVBand="1"/>
+      </w:tblPr>
+      <w:tblGrid>
+        <w:gridCol w:w="9245"/>
+      </w:tblGrid>
+      <w:tr>
+        <w:tc>
+          <w:tcPr>
+            <w:tcW w:w="9245" w:type="dxa"/>
+          </w:tcPr>
+          <w:p>
+            <w:pPr>
+              <w:keepNext/>
+              <w:spacing w:after="120"/>
+            </w:pPr>
+            <w:r>
+              <w:rPr>
+                <w:noProof/>
+              </w:rPr>
+              <w:drawing>
+                <wp:inline distT="0" distB="0" distL="0" distR="0" wp14:anchorId="2FF9B08E" wp14:editId="1BF98904">
+                  <wp:extent cx="5733415" cy="3081655"/>
+                  <wp:effectExtent l="0" t="0" r="635" b="4445"/>
+                  <wp:docPr id="997278204" name="Picture 15"/>
+                  <wp:cNvGraphicFramePr>
+                    <a:graphicFrameLocks xmlns:a="http://schemas.openxmlformats.org/drawingml/2006/main" noChangeAspect="1"/>
+                  </wp:cNvGraphicFramePr>
+                  <a:graphic xmlns:a="http://schemas.openxmlformats.org/drawingml/2006/main">
+                    <a:graphicData uri="http://schemas.openxmlformats.org/drawingml/2006/picture">
+                      <pic:pic xmlns:pic="http://schemas.openxmlformats.org/drawingml/2006/picture">
+                        <pic:nvPicPr>
+                          <pic:cNvPr id="997278204" name="Picture 997278204"/>
+                          <pic:cNvPicPr/>
+                        </pic:nvPicPr>
+                        <pic:blipFill>
+                          <a:blip r:embed="rId17"/>
+                          <a:stretch>
+                            <a:fillRect/>
+                          </a:stretch>
+                        </pic:blipFill>
+                        <pic:spPr>
+                          <a:xfrm>
+                            <a:off x="0" y="0"/>
+                            <a:ext cx="5733415" cy="3081655"/>
+                          </a:xfrm>
+                          <a:prstGeom prst="rect">
+                            <a:avLst/>
+                          </a:prstGeom>
+                        </pic:spPr>
+                      </pic:pic>
+                    </a:graphicData>
+                  </a:graphic>
+                </wp:inline>
+              </w:drawing>
+            </w:r>
+          </w:p>
+          <w:p>
+            <w:pPr>
+              <w:pStyle w:val="Caption"/>
+            </w:pPr>
+            <w:r>
+              <w:t xml:space="preserve">Gambar </w:t>
+            </w:r>
+            <w:fldSimple w:instr=" SEQ Gambar \* ARABIC ">
+              <w:r>
+                <w:rPr>
+                  <w:noProof/>
+                </w:rPr>
+                <w:t>1</w:t>
+              </w:r>
+            </w:fldSimple>
+            <w:r>
+              <w:t>: Modal Dialog Import Data SP2D MyIntress (Bab 3.5)</w:t>
+            </w:r>
+          </w:p>
+          <w:p>
+            <w:pPr>
+              <w:keepNext/>
+              <w:spacing w:after="120"/>
+            </w:pPr>
+            <w:r>
+              <w:rPr>
+                <w:noProof/>
+              </w:rPr>
+              <w:drawing>
+                <wp:inline distT="0" distB="0" distL="0" distR="0" wp14:anchorId="746DBFCF" wp14:editId="4EFB44A5">
+                  <wp:extent cx="5733415" cy="3081655"/>
+                  <wp:effectExtent l="0" t="0" r="635" b="4445"/>
+                  <wp:docPr id="1802384545" name="Picture 1"/>
+                  <wp:cNvGraphicFramePr>
+                    <a:graphicFrameLocks xmlns:a="http://schemas.openxmlformats.org/drawingml/2006/main" noChangeAspect="1"/>
+                  </wp:cNvGraphicFramePr>
+                  <a:graphic xmlns:a="http://schemas.openxmlformats.org/drawingml/2006/main">
+                    <a:graphicData uri="http://schemas.openxmlformats.org/drawingml/2006/picture">
+                      <pic:pic xmlns:pic="http://schemas.openxmlformats.org/drawingml/2006/picture">
+                        <pic:nvPicPr>
+                          <pic:cNvPr id="1802384545" name="Picture 1802384545"/>
+                          <pic:cNvPicPr/>
+                        </pic:nvPicPr>
+                        <pic:blipFill>
+                          <a:blip r:embed="rId8"/>
+                          <a:stretch>
+                            <a:fillRect/>
+                          </a:stretch>
+                        </pic:blipFill>
+                        <pic:spPr>
+                          <a:xfrm>
+                            <a:off x="0" y="0"/>
+                            <a:ext cx="5733415" cy="3081655"/>
+                          </a:xfrm>
+                          <a:prstGeom prst="rect">
+                            <a:avLst/>
+                          </a:prstGeom>
+                        </pic:spPr>
+                      </pic:pic>
+                    </a:graphicData>
+                  </a:graphic>
+                </wp:inline>
+              </w:drawing>
+            </w:r>
+          </w:p>
+          <w:p>
+            <w:pPr>
+              <w:pStyle w:val="Caption"/>
+            </w:pPr>
+            <w:r>
+              <w:t xml:space="preserve">Gambar </w:t>
+            </w:r>
+            <w:fldSimple w:instr=" SEQ Gambar \* ARABIC ">
+              <w:r>
+                <w:rPr>
+                  <w:noProof/>
+                </w:rPr>
+                <w:t>2</w:t>
+              </w:r>
+            </w:fldSimple>
+            <w:r>
+              <w:t>: Halaman Utama Data Rekap SP2D dan Opsi Ekspor Data (Bab 3.1 - 3.4 &amp; 3.7)</w:t>
+            </w:r>
+          </w:p>
+          <w:p>
+            <w:pPr>
+              <w:keepNext/>
+              <w:spacing w:after="120"/>
+            </w:pPr>
+            <w:r>
+              <w:rPr>
+                <w:noProof/>
+              </w:rPr>
+              <w:lastRenderedPageBreak/>
+              <w:drawing>
+                <wp:inline distT="0" distB="0" distL="0" distR="0" wp14:anchorId="7FC85866" wp14:editId="280974A9">
+                  <wp:extent cx="5733415" cy="3081655"/>
+                  <wp:effectExtent l="0" t="0" r="635" b="4445"/>
+                  <wp:docPr id="1062717244" name="Picture 8"/>
+                  <wp:cNvGraphicFramePr>
+                    <a:graphicFrameLocks xmlns:a="http://schemas.openxmlformats.org/drawingml/2006/main" noChangeAspect="1"/>
+                  </wp:cNvGraphicFramePr>
+                  <a:graphic xmlns:a="http://schemas.openxmlformats.org/drawingml/2006/main">
+                    <a:graphicData uri="http://schemas.openxmlformats.org/drawingml/2006/picture">
+                      <pic:pic xmlns:pic="http://schemas.openxmlformats.org/drawingml/2006/picture">
+                        <pic:nvPicPr>
+                          <pic:cNvPr id="1062717244" name="Picture 1062717244"/>
+                          <pic:cNvPicPr/>
+                        </pic:nvPicPr>
+                        <pic:blipFill>
+                          <a:blip r:embed="rId12"/>
+                          <a:stretch>
+                            <a:fillRect/>
+                          </a:stretch>
+                        </pic:blipFill>
+                        <pic:spPr>
+                          <a:xfrm>
+                            <a:off x="0" y="0"/>
+                            <a:ext cx="5733415" cy="3081655"/>
+                          </a:xfrm>
+                          <a:prstGeom prst="rect">
+                            <a:avLst/>
+                          </a:prstGeom>
+                        </pic:spPr>
+                      </pic:pic>
+                    </a:graphicData>
+                  </a:graphic>
+                </wp:inline>
+              </w:drawing>
+            </w:r>
+          </w:p>
+          <w:p>
+            <w:pPr>
+              <w:pStyle w:val="Caption"/>
+            </w:pPr>
+            <w:r>
+              <w:t xml:space="preserve">Gambar </w:t>
+            </w:r>
+            <w:fldSimple w:instr=" SEQ Gambar \* ARABIC ">
+              <w:r>
+                <w:rPr>
+                  <w:noProof/>
+                </w:rPr>
+                <w:t>3</w:t>
+              </w:r>
+            </w:fldSimple>
+            <w:r>
+              <w:t>: Panel Slide-Over Form Edit Rincian Pajak SP2D (Bab 3.6 A &amp; B)</w:t>
+            </w:r>
+          </w:p>
+          <w:p>
+            <w:pPr>
+              <w:keepNext/>
+              <w:spacing w:after="120"/>
+            </w:pPr>
+            <w:r>
+              <w:rPr>
+                <w:noProof/>
+              </w:rPr>
+              <w:lastRenderedPageBreak/>
+              <w:drawing>
+                <wp:inline distT="0" distB="0" distL="0" distR="0" wp14:anchorId="55F228E5" wp14:editId="6A684E16">
+                  <wp:extent cx="5733415" cy="3081655"/>
+                  <wp:effectExtent l="0" t="0" r="635" b="4445"/>
+                  <wp:docPr id="444276747" name="Picture 10"/>
+                  <wp:cNvGraphicFramePr>
+                    <a:graphicFrameLocks xmlns:a="http://schemas.openxmlformats.org/drawingml/2006/main" noChangeAspect="1"/>
+                  </wp:cNvGraphicFramePr>
+                  <a:graphic xmlns:a="http://schemas.openxmlformats.org/drawingml/2006/main">
+                    <a:graphicData uri="http://schemas.openxmlformats.org/drawingml/2006/picture">
+                      <pic:pic xmlns:pic="http://schemas.openxmlformats.org/drawingml/2006/picture">
+                        <pic:nvPicPr>
+                          <pic:cNvPr id="444276747" name="Picture 444276747"/>
+                          <pic:cNvPicPr/>
+                        </pic:nvPicPr>
+                        <pic:blipFill>
+                          <a:blip r:embed="rId14"/>
+                          <a:stretch>
+                            <a:fillRect/>
+                          </a:stretch>
+                        </pic:blipFill>
+                        <pic:spPr>
+                          <a:xfrm>
+                            <a:off x="0" y="0"/>
+                            <a:ext cx="5733415" cy="3081655"/>
+                          </a:xfrm>
+                          <a:prstGeom prst="rect">
+                            <a:avLst/>
+                          </a:prstGeom>
+                        </pic:spPr>
+                      </pic:pic>
+                    </a:graphicData>
+                  </a:graphic>
+                </wp:inline>
+              </w:drawing>
+            </w:r>
+          </w:p>
+          <w:p>
+            <w:pPr>
+              <w:pStyle w:val="Caption"/>
+            </w:pPr>
+            <w:r>
+              <w:t xml:space="preserve">Gambar </w:t>
+            </w:r>
+            <w:fldSimple w:instr=" SEQ Gambar \* ARABIC ">
+              <w:r>
+                <w:rPr>
+                  <w:noProof/>
+                </w:rPr>
+                <w:t>4</w:t>
+              </w:r>
+            </w:fldSimple>
+            <w:r>
+              <w:t>: Pilihan Jenis Berkas Excel pada Modal Upload Rincian Pajak (Bab 3.6 C)</w:t>
+            </w:r>
+          </w:p>
+          <w:p>
+            <w:pPr>
+              <w:keepNext/>
+              <w:spacing w:after="120"/>
+            </w:pPr>
+            <w:r>
+              <w:rPr>
+                <w:noProof/>
+              </w:rPr>
+              <w:drawing>
+                <wp:inline distT="0" distB="0" distL="0" distR="0" wp14:anchorId="3A492968" wp14:editId="750C4E27">
+                  <wp:extent cx="5733415" cy="3081655"/>
+                  <wp:effectExtent l="0" t="0" r="635" b="4445"/>
+                  <wp:docPr id="1366111032" name="Picture 9"/>
+                  <wp:cNvGraphicFramePr>
+                    <a:graphicFrameLocks xmlns:a="http://schemas.openxmlformats.org/drawingml/2006/main" noChangeAspect="1"/>
+                  </wp:cNvGraphicFramePr>
+                  <a:graphic xmlns:a="http://schemas.openxmlformats.org/drawingml/2006/main">
+                    <a:graphicData uri="http://schemas.openxmlformats.org/drawingml/2006/picture">
+                      <pic:pic xmlns:pic="http://schemas.openxmlformats.org/drawingml/2006/picture">
+                        <pic:nvPicPr>
+                          <pic:cNvPr id="1366111032" name="Picture 1366111032"/>
+                          <pic:cNvPicPr/>
+                        </pic:nvPicPr>
+                        <pic:blipFill>
+                          <a:blip r:embed="rId13"/>
+                          <a:stretch>
+                            <a:fillRect/>
+                          </a:stretch>
+                        </pic:blipFill>
+                        <pic:spPr>
+                          <a:xfrm>
+                            <a:off x="0" y="0"/>
+                            <a:ext cx="5733415" cy="3081655"/>
+                          </a:xfrm>
+                          <a:prstGeom prst="rect">
+                            <a:avLst/>
+                          </a:prstGeom>
+                        </pic:spPr>
+                      </pic:pic>
+                    </a:graphicData>
+                  </a:graphic>
+                </wp:inline>
+              </w:drawing>
+            </w:r>
+          </w:p>
+          <w:p>
+            <w:pPr>
+              <w:pStyle w:val="Caption"/>
+            </w:pPr>
+            <w:r>
+              <w:t xml:space="preserve">Gambar </w:t>
+            </w:r>
+            <w:fldSimple w:instr=" SEQ Gambar \* ARABIC ">
+              <w:r>
+                <w:rPr>
+                  <w:noProof/>
+                </w:rPr>
+                <w:t>5</w:t>
+              </w:r>
+            </w:fldSimple>
+            <w:r>
+              <w:t>: Pengunggahan Berkas Excel Pendukung Rincian Pajak (Bab 3.6 C)</w:t>
+            </w:r>
+          </w:p>
+          <w:p>
+            <w:pPr>
+              <w:keepNext/>
+              <w:spacing w:after="120"/>
+            </w:pPr>
+            <w:r>
+              <w:rPr>
+                <w:noProof/>
+              </w:rPr>
+              <w:drawing>
+                <wp:inline distT="0" distB="0" distL="0" distR="0" wp14:anchorId="73215075" wp14:editId="0F200AAA">
+                  <wp:extent cx="5733415" cy="3081655"/>
+                  <wp:effectExtent l="0" t="0" r="635" b="4445"/>
+                  <wp:docPr id="839333029" name="Picture 5"/>
+                  <wp:cNvGraphicFramePr>
+                    <a:graphicFrameLocks xmlns:a="http://schemas.openxmlformats.org/drawingml/2006/main" noChangeAspect="1"/>
+                  </wp:cNvGraphicFramePr>
+                  <a:graphic xmlns:a="http://schemas.openxmlformats.org/drawingml/2006/main">
+                    <a:graphicData uri="http://schemas.openxmlformats.org/drawingml/2006/picture">
+                      <pic:pic xmlns:pic="http://schemas.openxmlformats.org/drawingml/2006/picture">
+                        <pic:nvPicPr>
+                          <pic:cNvPr id="839333029" name="Picture 839333029"/>
+                          <pic:cNvPicPr/>
+                        </pic:nvPicPr>
+                        <pic:blipFill>
+                          <a:blip r:embed="rId11"/>
+                          <a:stretch>
+                            <a:fillRect/>
+                          </a:stretch>
+                        </pic:blipFill>
+                        <pic:spPr>
+                          <a:xfrm>
+                            <a:off x="0" y="0"/>
+                            <a:ext cx="5733415" cy="3081655"/>
+                          </a:xfrm>
+                          <a:prstGeom prst="rect">
+                            <a:avLst/>
+                          </a:prstGeom>
+                        </pic:spPr>
+                      </pic:pic>
+                    </a:graphicData>
+                  </a:graphic>
+                </wp:inline>
+              </w:drawing>
+            </w:r>
+          </w:p>
+          <w:p>
+            <w:pPr>
+              <w:pStyle w:val="Caption"/>
+            </w:pPr>
+            <w:r>
+              <w:t xml:space="preserve">Gambar </w:t>
+            </w:r>
+            <w:fldSimple w:instr=" SEQ Gambar \* ARABIC ">
+              <w:r>
+                <w:rPr>
+                  <w:noProof/>
+                </w:rPr>
+                <w:t>6</w:t>
+              </w:r>
+            </w:fldSimple>
+            <w:r>
+              <w:t>: Hasil Ekstraksi Rincian Pajak dan Indikator Total Rincian Sesuai (Bab 3.6 C &amp; F)</w:t>
+            </w:r>
+          </w:p>
+          <w:p>
+            <w:pPr>
+              <w:keepNext/>
+              <w:spacing w:after="120"/>
+            </w:pPr>
+            <w:r>
+              <w:rPr>
+                <w:noProof/>
+              </w:rPr>
+              <w:lastRenderedPageBreak/>
+              <w:drawing>
+                <wp:inline distT="0" distB="0" distL="0" distR="0" wp14:anchorId="7E98E85F" wp14:editId="6121F92D">
+                  <wp:extent cx="5733415" cy="3081655"/>
+                  <wp:effectExtent l="0" t="0" r="635" b="4445"/>
+                  <wp:docPr id="1885030672" name="Picture 13"/>
+                  <wp:cNvGraphicFramePr>
+                    <a:graphicFrameLocks xmlns:a="http://schemas.openxmlformats.org/drawingml/2006/main" noChangeAspect="1"/>
+                  </wp:cNvGraphicFramePr>
+                  <a:graphic xmlns:a="http://schemas.openxmlformats.org/drawingml/2006/main">
+                    <a:graphicData uri="http://schemas.openxmlformats.org/drawingml/2006/picture">
+                      <pic:pic xmlns:pic="http://schemas.openxmlformats.org/drawingml/2006/picture">
+                        <pic:nvPicPr>
+                          <pic:cNvPr id="1885030672" name="Picture 1885030672"/>
+                          <pic:cNvPicPr/>
+                        </pic:nvPicPr>
+                        <pic:blipFill>
+                          <a:blip r:embed="rId16"/>
+                          <a:stretch>
+                            <a:fillRect/>
+                          </a:stretch>
+                        </pic:blipFill>
+                        <pic:spPr>
+                          <a:xfrm>
+                            <a:off x="0" y="0"/>
+                            <a:ext cx="5733415" cy="3081655"/>
+                          </a:xfrm>
+                          <a:prstGeom prst="rect">
+                            <a:avLst/>
+                          </a:prstGeom>
+                        </pic:spPr>
+                      </pic:pic>
+                    </a:graphicData>
+                  </a:graphic>
+                </wp:inline>
+              </w:drawing>
+            </w:r>
+          </w:p>
+          <w:p>
+            <w:pPr>
+              <w:pStyle w:val="Caption"/>
+            </w:pPr>
+            <w:r>
+              <w:t xml:space="preserve">Gambar </w:t>
+            </w:r>
+            <w:fldSimple w:instr=" SEQ Gambar \* ARABIC ">
+              <w:r>
+                <w:rPr>
+                  <w:noProof/>
+                </w:rPr>
+                <w:t>7</w:t>
+              </w:r>
+            </w:fldSimple>
+            <w:r>
+              <w:t>: Pengisian Rincian Pajak Secara Manual dengan Autocomplete Pegawai (Bab 3.6 D)</w:t>
+            </w:r>
+          </w:p>
+          <w:p>
+            <w:pPr>
+              <w:keepNext/>
+              <w:spacing w:after="120"/>
+            </w:pPr>
+            <w:r>
+              <w:rPr>
+                <w:noProof/>
+              </w:rPr>
+              <w:drawing>
+                <wp:inline distT="0" distB="0" distL="0" distR="0" wp14:anchorId="5BBE4A57" wp14:editId="28AD8BBF">
+                  <wp:extent cx="5733415" cy="3081655"/>
+                  <wp:effectExtent l="0" t="0" r="635" b="4445"/>
+                  <wp:docPr id="24739435" name="Picture 12"/>
+                  <wp:cNvGraphicFramePr>
+                    <a:graphicFrameLocks xmlns:a="http://schemas.openxmlformats.org/drawingml/2006/main" noChangeAspect="1"/>
+                  </wp:cNvGraphicFramePr>
+                  <a:graphic xmlns:a="http://schemas.openxmlformats.org/drawingml/2006/main">
+                    <a:graphicData uri="http://schemas.openxmlformats.org/drawingml/2006/picture">
+                      <pic:pic xmlns:pic="http://schemas.openxmlformats.org/drawingml/2006/picture">
+                        <pic:nvPicPr>
+                          <pic:cNvPr id="24739435" name="Picture 24739435"/>
+                          <pic:cNvPicPr/>
+                        </pic:nvPicPr>
+                        <pic:blipFill>
+                          <a:blip r:embed="rId15"/>
+                          <a:stretch>
+                            <a:fillRect/>
+                          </a:stretch>
+                        </pic:blipFill>
+                        <pic:spPr>
+                          <a:xfrm>
+                            <a:off x="0" y="0"/>
+                            <a:ext cx="5733415" cy="3081655"/>
+                          </a:xfrm>
+                          <a:prstGeom prst="rect">
+                            <a:avLst/>
+                          </a:prstGeom>
+                        </pic:spPr>
+                      </pic:pic>
+                    </a:graphicData>
+                  </a:graphic>
+                </wp:inline>
+              </w:drawing>
+            </w:r>
+          </w:p>
+          <w:p>
+            <w:pPr>
+              <w:pStyle w:val="Caption"/>
+            </w:pPr>
+            <w:r>
+              <w:t xml:space="preserve">Gambar </w:t>
+            </w:r>
+            <w:fldSimple w:instr=" SEQ Gambar \* ARABIC ">
+              <w:r>
+                <w:rPr>
+                  <w:noProof/>
+                </w:rPr>
+                <w:t>8</w:t>
+              </w:r>
+            </w:fldSimple>
+            <w:r>
+              <w:t>: Pengelolaan SP2D Jalur UP dan Pemilihan Status Verifikasi (Bab 3.6 F)</w:t>
+            </w:r>
+          </w:p>
+          <w:p>
+            <w:pPr>
+              <w:keepNext/>
+              <w:spacing w:after="120"/>
+            </w:pPr>
+            <w:r>
+              <w:rPr>
+                <w:noProof/>
+              </w:rPr>
+              <w:lastRenderedPageBreak/>
+              <w:drawing>
+                <wp:inline distT="0" distB="0" distL="0" distR="0" wp14:anchorId="388675CA" wp14:editId="3A2F0A64">
+                  <wp:extent cx="5733415" cy="3081655"/>
+                  <wp:effectExtent l="0" t="0" r="635" b="4445"/>
+                  <wp:docPr id="2086826058" name="Picture 4"/>
+                  <wp:cNvGraphicFramePr>
+                    <a:graphicFrameLocks xmlns:a="http://schemas.openxmlformats.org/drawingml/2006/main" noChangeAspect="1"/>
+                  </wp:cNvGraphicFramePr>
+                  <a:graphic xmlns:a="http://schemas.openxmlformats.org/drawingml/2006/main">
+                    <a:graphicData uri="http://schemas.openxmlformats.org/drawingml/2006/picture">
+                      <pic:pic xmlns:pic="http://schemas.openxmlformats.org/drawingml/2006/picture">
+                        <pic:nvPicPr>
+                          <pic:cNvPr id="2086826058" name="Picture 2086826058"/>
+                          <pic:cNvPicPr/>
+                        </pic:nvPicPr>
+                        <pic:blipFill>
+                          <a:blip r:embed="rId10"/>
+                          <a:stretch>
+                            <a:fillRect/>
+                          </a:stretch>
+                        </pic:blipFill>
+                        <pic:spPr>
+                          <a:xfrm>
+                            <a:off x="0" y="0"/>
+                            <a:ext cx="5733415" cy="3081655"/>
+                          </a:xfrm>
+                          <a:prstGeom prst="rect">
+                            <a:avLst/>
+                          </a:prstGeom>
+                        </pic:spPr>
+                      </pic:pic>
+                    </a:graphicData>
+                  </a:graphic>
+                </wp:inline>
+              </w:drawing>
+            </w:r>
+          </w:p>
+          <w:p>
+            <w:pPr>
+              <w:pStyle w:val="Caption"/>
+            </w:pPr>
+            <w:r>
+              <w:t xml:space="preserve">Gambar </w:t>
+            </w:r>
+            <w:fldSimple w:instr=" SEQ Gambar \* ARABIC ">
+              <w:r>
+                <w:rPr>
+                  <w:noProof/>
+                </w:rPr>
+                <w:t>9</w:t>
+              </w:r>
+            </w:fldSimple>
+            <w:r>
+              <w:t>: Notifikasi Penyimpanan Berhasil dan Status Otomatis Menjadi Valid (Bab 3.6 F)</w:t>
+            </w:r>
+          </w:p>
+          <w:p>
+            <w:pPr>
+              <w:keepNext/>
+              <w:spacing w:after="120"/>
+            </w:pPr>
+            <w:r>
+              <w:rPr>
+                <w:noProof/>
+              </w:rPr>
+              <w:drawing>
+                <wp:inline distT="0" distB="0" distL="0" distR="0" wp14:anchorId="03A3B8D4" wp14:editId="4CE02CAA">
+                  <wp:extent cx="5733415" cy="3081655"/>
+                  <wp:effectExtent l="0" t="0" r="635" b="4445"/>
+                  <wp:docPr id="2001166950" name="Picture 2"/>
+                  <wp:cNvGraphicFramePr>
+                    <a:graphicFrameLocks xmlns:a="http://schemas.openxmlformats.org/drawingml/2006/main" noChangeAspect="1"/>
+                  </wp:cNvGraphicFramePr>
+                  <a:graphic xmlns:a="http://schemas.openxmlformats.org/drawingml/2006/main">
+                    <a:graphicData uri="http://schemas.openxmlformats.org/drawingml/2006/picture">
+                      <pic:pic xmlns:pic="http://schemas.openxmlformats.org/drawingml/2006/picture">
+                        <pic:nvPicPr>
+                          <pic:cNvPr id="2001166950" name="Picture 2001166950"/>
+                          <pic:cNvPicPr/>
+                        </pic:nvPicPr>
+                        <pic:blipFill>
+                          <a:blip r:embed="rId9"/>
+                          <a:stretch>
+                            <a:fillRect/>
+                          </a:stretch>
+                        </pic:blipFill>
+                        <pic:spPr>
+                          <a:xfrm>
+                            <a:off x="0" y="0"/>
+                            <a:ext cx="5733415" cy="3081655"/>
+                          </a:xfrm>
+                          <a:prstGeom prst="rect">
+                            <a:avLst/>
+                          </a:prstGeom>
+                        </pic:spPr>
+                      </pic:pic>
+                    </a:graphicData>
+                  </a:graphic>
+                </wp:inline>
+              </w:drawing>
+            </w:r>
+          </w:p>
+          <w:p>
+            <w:pPr>
+              <w:pStyle w:val="Caption"/>
+            </w:pPr>
+            <w:r>
+              <w:t xml:space="preserve">Gambar </w:t>
+            </w:r>
+            <w:fldSimple w:instr=" SEQ Gambar \* ARABIC ">
+              <w:r>
+                <w:rPr>
+                  <w:noProof/>
+                </w:rPr>
+                <w:t>10</w:t>
+              </w:r>
+            </w:fldSimple>
+            <w:r>
+              <w:t>: Halaman Laporan Rekapitulasi Pajak Per Pihak dan Opsi Unduh Ekspor (Bab 4)</w:t>
+            </w:r>
+          </w:p>
+          <w:p>
+            <w:pPr>
+              <w:keepNext/>
+              <w:spacing w:after="120"/>
+            </w:pPr>
+            <w:r>
+              <w:rPr>
+                <w:noProof/>
+              </w:rPr>
+              <w:drawing>
+                <wp:inline distT="0" distB="0" distL="0" distR="0" wp14:anchorId="475A09DC" wp14:editId="3CCCD3DC">
+                  <wp:extent cx="5733415" cy="3081655"/>
+                  <wp:effectExtent l="0" t="0" r="635" b="4445"/>
+                  <wp:docPr id="978694291" name="Picture 18"/>
+                  <wp:cNvGraphicFramePr>
+                    <a:graphicFrameLocks xmlns:a="http://schemas.openxmlformats.org/drawingml/2006/main" noChangeAspect="1"/>
+                  </wp:cNvGraphicFramePr>
+                  <a:graphic xmlns:a="http://schemas.openxmlformats.org/drawingml/2006/main">
+                    <a:graphicData uri="http://schemas.openxmlformats.org/drawingml/2006/picture">
+                      <pic:pic xmlns:pic="http://schemas.openxmlformats.org/drawingml/2006/picture">
+                        <pic:nvPicPr>
+                          <pic:cNvPr id="978694291" name="Picture 978694291"/>
+                          <pic:cNvPicPr/>
+                        </pic:nvPicPr>
+                        <pic:blipFill>
+                          <a:blip r:embed="rId19"/>
+                          <a:stretch>
+                            <a:fillRect/>
+                          </a:stretch>
+                        </pic:blipFill>
+                        <pic:spPr>
+                          <a:xfrm>
+                            <a:off x="0" y="0"/>
+                            <a:ext cx="5733415" cy="3081655"/>
+                          </a:xfrm>
+                          <a:prstGeom prst="rect">
+                            <a:avLst/>
+                          </a:prstGeom>
+                        </pic:spPr>
+                      </pic:pic>
+                    </a:graphicData>
+                  </a:graphic>
+                </wp:inline>
+              </w:drawing>
+            </w:r>
+          </w:p>
+          <w:p>
+            <w:pPr>
+              <w:pStyle w:val="Caption"/>
+            </w:pPr>
+            <w:r>
+              <w:t xml:space="preserve">Gambar </w:t>
+            </w:r>
+            <w:fldSimple w:instr=" SEQ Gambar \* ARABIC ">
+              <w:r>
+                <w:rPr>
+                  <w:noProof/>
+                </w:rPr>
+                <w:t>11</w:t>
+              </w:r>
+            </w:fldSimple>
+            <w:r>
+              <w:t>: Halaman Master Akun Pajak (Bab 5.1)</w:t>
+            </w:r>
+          </w:p>
+          <w:p>
+            <w:pPr>
+              <w:keepNext/>
+              <w:spacing w:after="120"/>
+            </w:pPr>
+            <w:r>
+              <w:rPr>
+                <w:noProof/>
+              </w:rPr>
+              <w:lastRenderedPageBreak/>
+              <w:drawing>
+                <wp:inline distT="0" distB="0" distL="0" distR="0" wp14:anchorId="11BE8C7C" wp14:editId="636D1E27">
+                  <wp:extent cx="5733415" cy="3081655"/>
+                  <wp:effectExtent l="0" t="0" r="635" b="4445"/>
+                  <wp:docPr id="1238612196" name="Picture 17"/>
+                  <wp:cNvGraphicFramePr>
+                    <a:graphicFrameLocks xmlns:a="http://schemas.openxmlformats.org/drawingml/2006/main" noChangeAspect="1"/>
+                  </wp:cNvGraphicFramePr>
+                  <a:graphic xmlns:a="http://schemas.openxmlformats.org/drawingml/2006/main">
+                    <a:graphicData uri="http://schemas.openxmlformats.org/drawingml/2006/picture">
+                      <pic:pic xmlns:pic="http://schemas.openxmlformats.org/drawingml/2006/picture">
+                        <pic:nvPicPr>
+                          <pic:cNvPr id="1238612196" name="Picture 1238612196"/>
+                          <pic:cNvPicPr/>
+                        </pic:nvPicPr>
+                        <pic:blipFill>
+                          <a:blip r:embed="rId18"/>
+                          <a:stretch>
+                            <a:fillRect/>
+                          </a:stretch>
+                        </pic:blipFill>
+                        <pic:spPr>
+                          <a:xfrm>
+                            <a:off x="0" y="0"/>
+                            <a:ext cx="5733415" cy="3081655"/>
+                          </a:xfrm>
+                          <a:prstGeom prst="rect">
+                            <a:avLst/>
+                          </a:prstGeom>
+                        </pic:spPr>
+                      </pic:pic>
+                    </a:graphicData>
+                  </a:graphic>
+                </wp:inline>
+              </w:drawing>
+            </w:r>
+          </w:p>
+          <w:p>
+            <w:pPr>
+              <w:pStyle w:val="Caption"/>
+            </w:pPr>
+            <w:r>
+              <w:t xml:space="preserve">Gambar </w:t>
+            </w:r>
+            <w:fldSimple w:instr=" SEQ Gambar \* ARABIC ">
+              <w:r>
+                <w:rPr>
+                  <w:noProof/>
+                </w:rPr>
+                <w:t>12</w:t>
+              </w:r>
+            </w:fldSimple>
+            <w:r>
+              <w:t>: Modal Tambah / Buat Data Master Akun Pajak Baru (Bab 5.1)</w:t>
+            </w:r>
+          </w:p>
+          <w:p>
+            <w:pPr>
+              <w:keepNext/>
+              <w:spacing w:after="120"/>
+            </w:pPr>
+            <w:r>
+              <w:rPr>
+                <w:noProof/>
+              </w:rPr>
+              <w:drawing>
+                <wp:inline distT="0" distB="0" distL="0" distR="0" wp14:anchorId="25EFB22C" wp14:editId="3E4F1231">
+                  <wp:extent cx="5733415" cy="3081655"/>
+                  <wp:effectExtent l="0" t="0" r="635" b="4445"/>
+                  <wp:docPr id="264368112" name="Picture 20"/>
+                  <wp:cNvGraphicFramePr>
+                    <a:graphicFrameLocks xmlns:a="http://schemas.openxmlformats.org/drawingml/2006/main" noChangeAspect="1"/>
+                  </wp:cNvGraphicFramePr>
+                  <a:graphic xmlns:a="http://schemas.openxmlformats.org/drawingml/2006/main">
+                    <a:graphicData uri="http://schemas.openxmlformats.org/drawingml/2006/picture">
+                      <pic:pic xmlns:pic="http://schemas.openxmlformats.org/drawingml/2006/picture">
+                        <pic:nvPicPr>
+                          <pic:cNvPr id="264368112" name="Picture 264368112"/>
+                          <pic:cNvPicPr/>
+                        </pic:nvPicPr>
+                        <pic:blipFill>
+                          <a:blip r:embed="rId21"/>
+                          <a:stretch>
+                            <a:fillRect/>
+                          </a:stretch>
+                        </pic:blipFill>
+                        <pic:spPr>
+                          <a:xfrm>
+                            <a:off x="0" y="0"/>
+                            <a:ext cx="5733415" cy="3081655"/>
+                          </a:xfrm>
+                          <a:prstGeom prst="rect">
+                            <a:avLst/>
+                          </a:prstGeom>
+                        </pic:spPr>
+                      </pic:pic>
+                    </a:graphicData>
+                  </a:graphic>
+                </wp:inline>
+              </w:drawing>
+            </w:r>
+          </w:p>
+          <w:p>
+            <w:pPr>
+              <w:pStyle w:val="Caption"/>
+            </w:pPr>
+            <w:r>
+              <w:t xml:space="preserve">Gambar </w:t>
+            </w:r>
+            <w:fldSimple w:instr=" SEQ Gambar \* ARABIC ">
+              <w:r>
+                <w:rPr>
+                  <w:noProof/>
+                </w:rPr>
+                <w:t>13</w:t>
+              </w:r>
+            </w:fldSimple>
+            <w:r>
+              <w:t>: Halaman Master Kode SPM (Bab 5.2)</w:t>
+            </w:r>
+          </w:p>
+          <w:p>
+            <w:pPr>
+              <w:keepNext/>
+              <w:spacing w:after="120"/>
+            </w:pPr>
+            <w:r>
+              <w:rPr>
+                <w:noProof/>
+              </w:rPr>
+              <w:lastRenderedPageBreak/>
+              <w:drawing>
+                <wp:inline distT="0" distB="0" distL="0" distR="0" wp14:anchorId="6AAF3ED8" wp14:editId="26EC9F5A">
+                  <wp:extent cx="5733415" cy="3081655"/>
+                  <wp:effectExtent l="0" t="0" r="635" b="4445"/>
+                  <wp:docPr id="98951427" name="Picture 19"/>
+                  <wp:cNvGraphicFramePr>
+                    <a:graphicFrameLocks xmlns:a="http://schemas.openxmlformats.org/drawingml/2006/main" noChangeAspect="1"/>
+                  </wp:cNvGraphicFramePr>
+                  <a:graphic xmlns:a="http://schemas.openxmlformats.org/drawingml/2006/main">
+                    <a:graphicData uri="http://schemas.openxmlformats.org/drawingml/2006/picture">
+                      <pic:pic xmlns:pic="http://schemas.openxmlformats.org/drawingml/2006/picture">
+                        <pic:nvPicPr>
+                          <pic:cNvPr id="98951427" name="Picture 98951427"/>
+                          <pic:cNvPicPr/>
+                        </pic:nvPicPr>
+                        <pic:blipFill>
+                          <a:blip r:embed="rId20"/>
+                          <a:stretch>
+                            <a:fillRect/>
+                          </a:stretch>
+                        </pic:blipFill>
+                        <pic:spPr>
+                          <a:xfrm>
+                            <a:off x="0" y="0"/>
+                            <a:ext cx="5733415" cy="3081655"/>
+                          </a:xfrm>
+                          <a:prstGeom prst="rect">
+                            <a:avLst/>
+                          </a:prstGeom>
+                        </pic:spPr>
+                      </pic:pic>
+                    </a:graphicData>
+                  </a:graphic>
+                </wp:inline>
+              </w:drawing>
+            </w:r>
+          </w:p>
+          <w:p>
+            <w:pPr>
+              <w:pStyle w:val="Caption"/>
+            </w:pPr>
+            <w:r>
+              <w:t xml:space="preserve">Gambar </w:t>
+            </w:r>
+            <w:fldSimple w:instr=" SEQ Gambar \* ARABIC ">
+              <w:r>
+                <w:rPr>
+                  <w:noProof/>
+                </w:rPr>
+                <w:t>14</w:t>
+              </w:r>
+            </w:fldSimple>
+            <w:r>
+              <w:t>: Form Tambah / Buat Kode SPM Baru beserta Jalur Verifikasi (Bab 5.2)</w:t>
+            </w:r>
+          </w:p>
+        </w:tc>
+      </w:tr>
+    </w:tbl>
+    <w:p>
+      <w:pPr>
+        <w:spacing w:after="120"/>
+      </w:pPr>
+      <w:r>
+        <w:t>Berikut adalah kumpulan tangkapan layar (screenshot) antarmuka Modul Rekap SP2D &amp; Pajak BPS Kabupaten Demak yang disusun secara berurutan sesuai alur operasional dan deskripsi pada bab-bab sebelumnya:</w:t>
+      </w:r>
+    </w:p>
     <w:sectPr>
-      <w:headerReference w:type="default" r:id="rId8"/>
-      <w:footerReference w:type="default" r:id="rId9"/>
+      <w:headerReference w:type="default" r:id="rId22"/>
+      <w:footerReference w:type="default" r:id="rId23"/>
       <w:pgSz w:w="11909" w:h="16834"/>
       <w:pgMar w:top="1440" w:right="1440" w:bottom="1440" w:left="1440" w:header="720" w:footer="720" w:gutter="0"/>
       <w:cols w:space="720"/>
@@ -6822,7 +7688,6 @@
     <w:basedOn w:val="Normal"/>
     <w:next w:val="Normal"/>
     <w:uiPriority w:val="35"/>
-    <w:semiHidden/>
     <w:unhideWhenUsed/>
     <w:qFormat/>
     <w:rsid w:val="00FC693F"/>

</xml_diff>